<commit_message>
fix(workspace): repair blank OOXML templates and editor /ds base URL
Incomplete blank.docx (missing document.xml.rels/styles) made DocumentServer
show Download failed after the ribbon loaded; also set documentServerUrl and
ALLOW_META_IP_ADDRESS for compose-internal downloads.

Co-authored-by: Cursor <cursoragent@cursor.com>
</commit_message>
<xml_diff>
--- a/indobase-suite/bridge/templates/blank.docx
+++ b/indobase-suite/bridge/templates/blank.docx
@@ -7,6 +7,16 @@
         <w:t/>
       </w:r>
     </w:p>
+    <w:sectPr/>
   </w:body>
 </w:document>
+</file>
+
+<file path=word/styles.xml><?xml version="1.0" encoding="utf-8"?>
+<w:styles xmlns:w="http://schemas.openxmlformats.org/wordprocessingml/2006/main">
+  <w:style w:type="paragraph" w:default="1" w:styleId="Normal">
+    <w:name w:val="Normal"/>
+    <w:qFormat/>
+  </w:style>
+</w:styles>
 </file>
</xml_diff>

<commit_message>
fix(workspace): ship DocumentServer-valid blank.docx relationships
Empty word/_rels/document.xml.rels still caused Download failed after the
partial OOXML stub fix; include styles/settings/fontTable links and assert them.
</commit_message>
<xml_diff>
--- a/indobase-suite/bridge/templates/blank.docx
+++ b/indobase-suite/bridge/templates/blank.docx
@@ -1,19 +1,32 @@
 
 <file path=word/document.xml><?xml version="1.0" encoding="utf-8"?>
-<w:document xmlns:w="http://schemas.openxmlformats.org/wordprocessingml/2006/main">
+<w:document xmlns:wpc="http://schemas.microsoft.com/office/word/2010/wordprocessingCanvas" xmlns:mc="http://schemas.openxmlformats.org/markup-compatibility/2006" xmlns:o="urn:schemas-microsoft-com:office:office" xmlns:r="http://schemas.openxmlformats.org/officeDocument/2006/relationships" xmlns:m="http://schemas.openxmlformats.org/officeDocument/2006/math" xmlns:v="urn:schemas-microsoft-com:vml" xmlns:wp14="http://schemas.microsoft.com/office/word/2010/wordprocessingDrawing" xmlns:wp="http://schemas.openxmlformats.org/drawingml/2006/wordprocessingDrawing" xmlns:w10="urn:schemas-microsoft-com:office:word" xmlns:w="http://schemas.openxmlformats.org/wordprocessingml/2006/main" xmlns:w14="http://schemas.microsoft.com/office/word/2010/wordml" xmlns:wpg="http://schemas.microsoft.com/office/word/2010/wordprocessingGroup" xmlns:wpi="http://schemas.microsoft.com/office/word/2010/wordprocessingInk" xmlns:wne="http://schemas.microsoft.com/office/word/2006/wordml" xmlns:wps="http://schemas.microsoft.com/office/word/2010/wordprocessingShape" mc:Ignorable="w14 wp14">
   <w:body>
     <w:p>
       <w:r>
         <w:t/>
       </w:r>
     </w:p>
-    <w:sectPr/>
+    <w:sectPr>
+      <w:pgSz w:w="12240" w:h="15840"/>
+      <w:pgMar w:top="1440" w:right="1440" w:bottom="1440" w:left="1440" w:header="720" w:footer="720" w:gutter="0"/>
+    </w:sectPr>
   </w:body>
 </w:document>
 </file>
 
 <file path=word/styles.xml><?xml version="1.0" encoding="utf-8"?>
-<w:styles xmlns:w="http://schemas.openxmlformats.org/wordprocessingml/2006/main">
+<w:styles xmlns:mc="http://schemas.openxmlformats.org/markup-compatibility/2006" xmlns:r="http://schemas.openxmlformats.org/officeDocument/2006/relationships" xmlns:w="http://schemas.openxmlformats.org/wordprocessingml/2006/main" xmlns:w14="http://schemas.microsoft.com/office/word/2010/wordml" mc:Ignorable="w14">
+  <w:docDefaults>
+    <w:rPrDefault>
+      <w:rPr>
+        <w:rFonts w:ascii="Calibri" w:hAnsi="Calibri" w:eastAsia="Calibri" w:cs="Calibri"/>
+        <w:sz w:val="22"/>
+        <w:szCs w:val="22"/>
+      </w:rPr>
+    </w:rPrDefault>
+    <w:pPrDefault/>
+  </w:docDefaults>
   <w:style w:type="paragraph" w:default="1" w:styleId="Normal">
     <w:name w:val="Normal"/>
     <w:qFormat/>

</xml_diff>